<commit_message>
docs: completed level in ADR-0043; contract 3.4 gains the level-end sentence
The lawyer copy marks the added sentence as an insertion with its
reason; the clean copy carries it as text.

Co-Authored-By: Claude Opus 5.5 <noreply@anthropic.com>
</commit_message>
<xml_diff>
--- a/docs/tolov-savollari/shartnoma-2026-taklif.docx
+++ b/docs/tolov-savollari/shartnoma-2026-taklif.docx
@@ -1901,6 +1901,24 @@
         </w:rPr>
         <w:commentReference w:id="6"/>
       </w:r>
+      <w:commentRangeStart w:id="14"/>
+      <w:ins w:id="947" w:author="Claude" w:date="2026-09-27T19:26:00Z">
+        <w:r>
+          <w:rPr>
+            <w:sz w:val="22"/>
+            <w:szCs w:val="22"/>
+            <w:lang w:val="en-US"/>
+          </w:rPr>
+          <w:t xml:space="preserve"> Daraja oy o'rtasida yakunlansa, shu oy uchun faqat daraja yakunlanguniga qadar o'tilgan darslar haqi 1 dars qiymati bo'yicha to'lanadi; bu 6.2-band bo'yicha bekor qilish hisoblanmaydi.</w:t>
+        </w:r>
+      </w:ins>
+      <w:commentRangeEnd w:id="14"/>
+      <w:r>
+        <w:rPr>
+          <w:rStyle w:val="CommentReference"/>
+        </w:rPr>
+        <w:commentReference w:id="14"/>
+      </w:r>
     </w:p>
     <w:p>
       <w:pPr>
@@ -3794,6 +3812,24 @@
       </w:r>
     </w:p>
   </w:comment>
+  <w:comment w:id="14" w:author="Claude" w:date="2026-09-27T19:26:00Z" w:initials="C">
+    <w:p>
+      <w:r>
+        <w:rPr>
+          <w:rStyle w:val="CommentReference"/>
+        </w:rPr>
+        <w:annotationRef/>
+      </w:r>
+      <w:r>
+        <w:rPr>
+          <w:color w:val="000000"/>
+          <w:sz w:val="20"/>
+          <w:szCs w:val="20"/>
+        </w:rPr>
+        <w:t xml:space="preserve">Shartnoma bitta daraja uchun tuziladi va kurs yakunlanguncha amal qiladi (2.1, 10.1). Daraja oy o'rtasida tugab, o'quvchi sertifikat olib to'xtasa yoki keyingi darajani kutsa, u o'qimagan darslar uchun to'lamasligi kerak. Bu bekor qilish emas, shuning uchun 6.2-banddagi 40% qoidasi qo'llanmaydi.</w:t>
+      </w:r>
+    </w:p>
+  </w:comment>
 </w:comments>
 </file>
 
@@ -3813,6 +3849,7 @@
   <w15:commentEx w15:paraId="4C4A7284" w15:done="0"/>
   <w15:commentEx w15:paraId="35A5B568" w15:done="0"/>
   <w15:commentEx w15:paraId="3F3AD463" w15:done="0"/>
+  <w15:commentEx w15:paraId="1A2B3C4D" w15:done="0"/>
 </w15:commentsEx>
 </file>
 
@@ -3832,6 +3869,7 @@
   <w16cex:commentExtensible w16cex:durableId="422F762E" w16cex:dateUtc="2026-09-24T10:48:43Z"/>
   <w16cex:commentExtensible w16cex:durableId="2AA535FB" w16cex:dateUtc="2026-09-24T10:48:43Z"/>
   <w16cex:commentExtensible w16cex:durableId="6A3CA3C8" w16cex:dateUtc="2026-09-24T10:48:43Z"/>
+  <w16cex:commentExtensible w16cex:durableId="5C3E9A71" w16cex:dateUtc="2026-09-27T19:26:00Z"/>
 </w16cex:commentsExtensible>
 </file>
 
@@ -3851,6 +3889,7 @@
   <w16cid:commentId w16cid:paraId="4C4A7284" w16cid:durableId="422F762E"/>
   <w16cid:commentId w16cid:paraId="35A5B568" w16cid:durableId="2AA535FB"/>
   <w16cid:commentId w16cid:paraId="3F3AD463" w16cid:durableId="6A3CA3C8"/>
+  <w16cid:commentId w16cid:paraId="1A2B3C4D" w16cid:durableId="5C3E9A71"/>
 </w16cid:commentsIds>
 </file>
 

</xml_diff>

<commit_message>
docs: ADR-0044 — a completed level; contract 3.4 gains the level-end sentence
ADR-0043 is accepted, so it is not edited: ADR-0044 restates the whole
rule with the fourth policy and ADR-0043 is marked replaced. The lawyer
copy of the contract marks the added 3.4 sentence as an insertion with
its reason; the clean copy carries it as text.

Co-Authored-By: Claude Opus 5.5 <noreply@anthropic.com>
</commit_message>
<xml_diff>
--- a/docs/tolov-savollari/shartnoma-2026-taklif.docx
+++ b/docs/tolov-savollari/shartnoma-2026-taklif.docx
@@ -1901,6 +1901,24 @@
         </w:rPr>
         <w:commentReference w:id="6"/>
       </w:r>
+      <w:commentRangeStart w:id="14"/>
+      <w:ins w:id="947" w:author="Claude" w:date="2026-09-27T19:26:00Z">
+        <w:r>
+          <w:rPr>
+            <w:sz w:val="22"/>
+            <w:szCs w:val="22"/>
+            <w:lang w:val="en-US"/>
+          </w:rPr>
+          <w:t xml:space="preserve"> Daraja oy o'rtasida yakunlansa, shu oy uchun faqat daraja yakunlanguniga qadar o'tilgan darslar haqi 1 dars qiymati bo'yicha to'lanadi; bu 6.2-band bo'yicha bekor qilish hisoblanmaydi.</w:t>
+        </w:r>
+      </w:ins>
+      <w:commentRangeEnd w:id="14"/>
+      <w:r>
+        <w:rPr>
+          <w:rStyle w:val="CommentReference"/>
+        </w:rPr>
+        <w:commentReference w:id="14"/>
+      </w:r>
     </w:p>
     <w:p>
       <w:pPr>
@@ -3794,6 +3812,24 @@
       </w:r>
     </w:p>
   </w:comment>
+  <w:comment w:id="14" w:author="Claude" w:date="2026-09-27T19:26:00Z" w:initials="C">
+    <w:p>
+      <w:r>
+        <w:rPr>
+          <w:rStyle w:val="CommentReference"/>
+        </w:rPr>
+        <w:annotationRef/>
+      </w:r>
+      <w:r>
+        <w:rPr>
+          <w:color w:val="000000"/>
+          <w:sz w:val="20"/>
+          <w:szCs w:val="20"/>
+        </w:rPr>
+        <w:t xml:space="preserve">Shartnoma bitta daraja uchun tuziladi va kurs yakunlanguncha amal qiladi (2.1, 10.1). Daraja oy o'rtasida tugab, o'quvchi sertifikat olib to'xtasa yoki keyingi darajani kutsa, u o'qimagan darslar uchun to'lamasligi kerak. Bu bekor qilish emas, shuning uchun 6.2-banddagi 40% qoidasi qo'llanmaydi.</w:t>
+      </w:r>
+    </w:p>
+  </w:comment>
 </w:comments>
 </file>
 
@@ -3813,6 +3849,7 @@
   <w15:commentEx w15:paraId="4C4A7284" w15:done="0"/>
   <w15:commentEx w15:paraId="35A5B568" w15:done="0"/>
   <w15:commentEx w15:paraId="3F3AD463" w15:done="0"/>
+  <w15:commentEx w15:paraId="1A2B3C4D" w15:done="0"/>
 </w15:commentsEx>
 </file>
 
@@ -3832,6 +3869,7 @@
   <w16cex:commentExtensible w16cex:durableId="422F762E" w16cex:dateUtc="2026-09-24T10:48:43Z"/>
   <w16cex:commentExtensible w16cex:durableId="2AA535FB" w16cex:dateUtc="2026-09-24T10:48:43Z"/>
   <w16cex:commentExtensible w16cex:durableId="6A3CA3C8" w16cex:dateUtc="2026-09-24T10:48:43Z"/>
+  <w16cex:commentExtensible w16cex:durableId="5C3E9A71" w16cex:dateUtc="2026-09-27T19:26:00Z"/>
 </w16cex:commentsExtensible>
 </file>
 
@@ -3851,6 +3889,7 @@
   <w16cid:commentId w16cid:paraId="4C4A7284" w16cid:durableId="422F762E"/>
   <w16cid:commentId w16cid:paraId="35A5B568" w16cid:durableId="2AA535FB"/>
   <w16cid:commentId w16cid:paraId="3F3AD463" w16cid:durableId="6A3CA3C8"/>
+  <w16cid:commentId w16cid:paraId="1A2B3C4D" w16cid:durableId="5C3E9A71"/>
 </w16cid:commentsIds>
 </file>
 

</xml_diff>